<commit_message>
Refine W2 visuals and student-owned writing choices
</commit_message>
<xml_diff>
--- a/worksheets/W2.docx
+++ b/worksheets/W2.docx
@@ -340,7 +340,7 @@
           <w:color w:val="1A2340"/>
           <w:sz w:val="22"/>
         </w:rPr>
-        <w:t>要查：今天全店飲料第二件半價。以下是教學用模擬資料，不是真實店家活動。</w:t>
+        <w:t>要查：今天全店飲料第二件半價。教學模擬；先寫依據，學過三色再勾色。</w:t>
       </w:r>
     </w:p>
     <w:p>
@@ -1809,7 +1809,7 @@
           <w:color w:val="5B6573"/>
           <w:sz w:val="22"/>
         </w:rPr>
-        <w:t>提示詞就是給 AI 的指令。AI 回覆後，只截圖六句，用手機內建標記圈出要查的字詞，再上傳 Classroom；不要截到上方資訊卡或整段聊天。沒有裝置，使用老師提供的「匿名事件卡＋配對六句」，直接在紙上圈，最後拍照上傳。</w:t>
+        <w:t>提示詞就是給 AI 的指令。只截首次六句，圈出要查片段；不截資訊卡或整段聊天，下課前再上傳。沒有裝置／不想輸入生活輪廓，用成對 Plan B 材料在紙上圈，老師協助備份。</w:t>
       </w:r>
     </w:p>
     <w:p>
@@ -1900,7 +1900,7 @@
           <w:color w:val="5B6573"/>
           <w:sz w:val="22"/>
         </w:rPr>
-        <w:t>針對圈出的片段判色。短記：綠＝支持依據，紅＝衝突依據，黃＝缺什麼（不知道也可寫）。同句可分開判，不用重抄六句。</w:t>
+        <w:t>針對圈出的片段判色。同句可分開判；短記支持／衝突依據或缺什麼，不抄六句。圈選一列說明；全綠選依據最薄弱的一句。</w:t>
       </w:r>
     </w:p>
     <w:tbl>
@@ -3601,7 +3601,7 @@
           <w:color w:val="5B6573"/>
           <w:sz w:val="22"/>
         </w:rPr>
-        <w:t>抄下一個你可以確認的具體句子或細節，並寫你靠什麼確認。</w:t>
+        <w:t>若有綠色，抄一個句子或細節，寫靠什麼確認；沒有就寫「本次未出現」，不用湊色。</w:t>
       </w:r>
     </w:p>
     <w:tbl>
@@ -3727,7 +3727,7 @@
           <w:color w:val="5B6573"/>
           <w:sz w:val="22"/>
         </w:rPr>
-        <w:t>如果有，抄下一個有證據直接衝突的地方（沒有紅色也可以）；若全綠，勾「□ 全綠」，並確認每句都已寫具體依據。</w:t>
+        <w:t>若有紅色，抄一個直接衝突的地方；沒有就寫「本次未出現」。沒有紅色不等於全綠。</w:t>
       </w:r>
     </w:p>
     <w:tbl>
@@ -4389,10 +4389,10 @@
           <w:rFonts w:ascii="Arial Unicode MS" w:hAnsi="Arial Unicode MS" w:eastAsia="Arial Unicode MS"/>
           <w:b/>
           <w:i w:val="0"/>
-          <w:color w:val="1D4ED8"/>
+          <w:color w:val="5B6573"/>
           <w:sz w:val="22"/>
         </w:rPr>
-        <w:t>課堂必寫</w:t>
+        <w:t>回家另紙寫</w:t>
       </w:r>
       <w:r>
         <w:rPr>
@@ -4921,7 +4921,7 @@
           <w:color w:val="1A2340"/>
           <w:sz w:val="22"/>
         </w:rPr>
-        <w:t>先寫完，再看：朋友後來說：『我剛剛在排練，現在才有空。』</w:t>
+        <w:t>先完成上半部。等老師顯示新訊息，再寫下面；保留第一版。</w:t>
       </w:r>
     </w:p>
     <w:p>

</xml_diff>